<commit_message>
docs: finalize post-release documentation
</commit_message>
<xml_diff>
--- a/docs/report/Final_Report.docx
+++ b/docs/report/Final_Report.docx
@@ -270,7 +270,17 @@
     </w:p>
     <w:p>
       <w:r>
-        <w:t xml:space="preserve">Hệ thống hiện gồm ứng dụng Node.js 24/Express, PostgreSQL 16, pgAdmin, Nginx unprivileged, sáu Prometheus scrape targets, Grafana, Loki và Promtail. Các checkpoint CP0–CP6 đã PASS; YC1 final/CP-Final được xác minh trong Prompt 8. YC7 hoàn thiện báo cáo, kịch bản demo diễn tập thực tế, Q&amp;A và giải phóng toàn bộ blocker hành chính/GitHub. Commit 6/tag </w:t>
+        <w:t>Hệ thống hiện gồm ứng dụng Node.js 24/Express, PostgreSQL 16, pgAdmin, Nginx unprivileged, sáu Prometheus scrape targets, Grafana, Loki và Promtail. Các checkpoint CP0–CP6 đã PASS; YC1 final/CP-Final được xác minh trong Prompt 8. YC7 hoàn thiện báo cáo, kịch bản demo diễn tập thực tế, Q&amp;A và giải phóng toàn bộ blocker hành chính/GitHub. Commit 6 (</w:t>
+      </w:r>
+      <w:r>
+        <w:rPr>
+          <w:rFonts w:ascii="Consolas" w:hAnsi="Consolas"/>
+          <w:sz w:val="17"/>
+        </w:rPr>
+        <w:t>fded947d98441446e8c424e657a51f88ea5edfbb</w:t>
+      </w:r>
+      <w:r>
+        <w:t xml:space="preserve">) và tag </w:t>
       </w:r>
       <w:r>
         <w:rPr>
@@ -280,7 +290,7 @@
         <w:t>v1.0</w:t>
       </w:r>
       <w:r>
-        <w:t xml:space="preserve"> được tạo sau khi toàn bộ final release gates đạt PASS.</w:t>
+        <w:t xml:space="preserve"> đã được tạo và phát hành.</w:t>
       </w:r>
     </w:p>
     <w:p>
@@ -4635,7 +4645,11 @@
           </w:tcPr>
           <w:p>
             <w:r>
-              <w:t>Target final release milestone commit</w:t>
+              <w:rPr>
+                <w:rFonts w:ascii="Consolas" w:hAnsi="Consolas"/>
+                <w:sz w:val="17"/>
+              </w:rPr>
+              <w:t>fded947d98441446e8c424e657a51f88ea5edfbb</w:t>
             </w:r>
           </w:p>
         </w:tc>

</xml_diff>